<commit_message>
Remove rascunhos do relatorio da Fase 2; mantem so a versao final
- Apagados Relatorio_Executivo_Fase2_Olist_RASCUNHO.pdf/.docx (conteudo de
  21/10, sem os ajustes do Leo), para evitar submissao do arquivo errado.
- EVOLUCAO e docs de apoio apontam para a versao FINAL.

Co-Authored-By: Claude Opus 5.5 <noreply@anthropic.com>
</commit_message>
<xml_diff>
--- a/fase2/Entregaveis_Fase2.docx
+++ b/fase2/Entregaveis_Fase2.docx
@@ -1170,30 +1170,6 @@
                 <w:rFonts w:ascii="Consolas" w:hAnsi="Consolas"/>
                 <w:sz w:val="13"/>
               </w:rPr>
-              <w:t>│   ├── Relatorio_Executivo_Fase2_Olist_RASCUNHO.pdf   ENTREGÁVEL 1 · relatório v2.0 (rascunho)</w:t>
-            </w:r>
-          </w:p>
-          <w:p>
-            <w:pPr>
-              <w:spacing w:after="0"/>
-            </w:pPr>
-            <w:r>
-              <w:rPr>
-                <w:rFonts w:ascii="Consolas" w:hAnsi="Consolas"/>
-                <w:sz w:val="13"/>
-              </w:rPr>
-              <w:t>│   ├── Relatorio_Executivo_Fase2_Olist_RASCUNHO.docx  Mesmo relatório em Word (para comentários)</w:t>
-            </w:r>
-          </w:p>
-          <w:p>
-            <w:pPr>
-              <w:spacing w:after="0"/>
-            </w:pPr>
-            <w:r>
-              <w:rPr>
-                <w:rFonts w:ascii="Consolas" w:hAnsi="Consolas"/>
-                <w:sz w:val="13"/>
-              </w:rPr>
               <w:t>│   ├── Relatorio_Executivo_Fase2_Olist_FINAL.pdf      ENTREGÁVEL 1 · versão final (gerada com o link do vídeo)</w:t>
             </w:r>
           </w:p>

</xml_diff>